<commit_message>
Update the resume and experience timeline, including GenAI Lakes through Sep 2026.
</commit_message>
<xml_diff>
--- a/Pettem_Sai_Sriya_Resume.docx
+++ b/Pettem_Sai_Sriya_Resume.docx
@@ -72,7 +72,7 @@
           <w:b w:val="0"/>
           <w:sz w:val="21"/>
         </w:rPr>
-        <w:t>Full Stack Developer at GenAI Lakes building React, TypeScript, Node.js, and Python applications. Skilled in REST APIs, FastAPI, MongoDB, PostgreSQL, and Generative AI including RAG, embeddings, semantic search, and LLM-based document question answering. B.Tech ECE, CGPA 7.6.</w:t>
+        <w:t>Full Stack Developer (immediately available, Hyderabad) with 1+ year building React, Node.js, and Python products. Shipped REST APIs, dashboards, and Generative AI features including RAG, embeddings, semantic search, and LLM document Q&amp;A. B.Tech ECE, CGPA 7.6.</w:t>
       </w:r>
     </w:p>
     <w:p>
@@ -131,7 +131,7 @@
           <w:b w:val="0"/>
           <w:sz w:val="21"/>
         </w:rPr>
-        <w:t>React, Node.js, Express.js, FastAPI, Tailwind CSS</w:t>
+        <w:t>React, FastAPI, Node.js, Express.js, Socket.IO, Tailwind CSS</w:t>
       </w:r>
     </w:p>
     <w:p>
@@ -152,7 +152,7 @@
           <w:b w:val="0"/>
           <w:sz w:val="21"/>
         </w:rPr>
-        <w:t>MongoDB, PostgreSQL, MySQL, SQLAlchemy</w:t>
+        <w:t>PostgreSQL, MongoDB, MySQL, Redis, SQLAlchemy</w:t>
       </w:r>
     </w:p>
     <w:p>
@@ -173,7 +173,7 @@
           <w:b w:val="0"/>
           <w:sz w:val="21"/>
         </w:rPr>
-        <w:t>Git, GitHub, VS Code, Vite, REST APIs, JWT</w:t>
+        <w:t>Git, GitHub Actions, Docker, Pytest, Vite, REST APIs, JWT</w:t>
       </w:r>
     </w:p>
     <w:p>
@@ -227,7 +227,7 @@
           <w:b/>
           <w:sz w:val="21"/>
         </w:rPr>
-        <w:t>Full Stack Developer  |  GenAI Lakes  |  Hyderabad, India</w:t>
+        <w:t>AI Evaluation Specialist  |  Handshake AI</w:t>
       </w:r>
       <w:r>
         <w:rPr>
@@ -236,7 +236,7 @@
           <w:sz w:val="21"/>
         </w:rPr>
         <w:tab/>
-        <w:t>July 2025 – Present</w:t>
+        <w:t>Jul 2026 – Present</w:t>
       </w:r>
     </w:p>
     <w:p>
@@ -250,7 +250,7 @@
           <w:b w:val="0"/>
           <w:sz w:val="21"/>
         </w:rPr>
-        <w:t>Designed and developed full-stack web applications using React, JavaScript, HTML, CSS, and REST APIs.</w:t>
+        <w:t>Design terminal-based benchmark tasks that evaluate coding agents on multi-step Linux, Git, Bash, and Python workflows.</w:t>
       </w:r>
     </w:p>
     <w:p>
@@ -264,7 +264,7 @@
           <w:b w:val="0"/>
           <w:sz w:val="21"/>
         </w:rPr>
-        <w:t>Integrated secure RESTful APIs and backend services; implemented database operations with MongoDB, MySQL, and PostgreSQL.</w:t>
+        <w:t>Build reproducible environments with automated validation so tasks score consistently across model runs and reviewers.</w:t>
       </w:r>
     </w:p>
     <w:p>
@@ -278,7 +278,7 @@
           <w:b w:val="0"/>
           <w:sz w:val="21"/>
         </w:rPr>
-        <w:t>Debugged and tested application performance and reliability while shipping Generative AI and web features with cross-functional teams.</w:t>
+        <w:t>Revise task specifications and graders after human review when an agent passes a check but misses the intended engineering behavior.</w:t>
       </w:r>
     </w:p>
     <w:p>
@@ -294,7 +294,7 @@
           <w:b/>
           <w:sz w:val="21"/>
         </w:rPr>
-        <w:t>Frontend Development Intern  |  AICTE</w:t>
+        <w:t>Full Stack Developer  |  GenAI Lakes  |  Hyderabad, India</w:t>
       </w:r>
       <w:r>
         <w:rPr>
@@ -303,7 +303,7 @@
           <w:sz w:val="21"/>
         </w:rPr>
         <w:tab/>
-        <w:t>July 2024 – February 2025</w:t>
+        <w:t>Jul 2025 – Sep 2026</w:t>
       </w:r>
     </w:p>
     <w:p>
@@ -317,7 +317,169 @@
           <w:b w:val="0"/>
           <w:sz w:val="21"/>
         </w:rPr>
-        <w:t>Completed the AICTE Frontend Development Internship; built a resume builder web application using HTML, CSS, JavaScript, React, and responsive UI.</w:t>
+        <w:t>Designed and developed scalable full-stack web applications using modern frontend and backend technologies.</w:t>
+      </w:r>
+    </w:p>
+    <w:p>
+      <w:pPr>
+        <w:pStyle w:val="ListBullet"/>
+        <w:spacing w:before="0" w:after="20" w:lineRule="exact" w:line="226"/>
+      </w:pPr>
+      <w:r>
+        <w:rPr>
+          <w:rFonts w:ascii="Calibri" w:hAnsi="Calibri" w:eastAsia="Calibri"/>
+          <w:b w:val="0"/>
+          <w:sz w:val="21"/>
+        </w:rPr>
+        <w:t>Built responsive, user-centric interfaces while integrating secure RESTful APIs and backend services.</w:t>
+      </w:r>
+    </w:p>
+    <w:p>
+      <w:pPr>
+        <w:pStyle w:val="ListBullet"/>
+        <w:spacing w:before="0" w:after="20" w:lineRule="exact" w:line="226"/>
+      </w:pPr>
+      <w:r>
+        <w:rPr>
+          <w:rFonts w:ascii="Calibri" w:hAnsi="Calibri" w:eastAsia="Calibri"/>
+          <w:b w:val="0"/>
+          <w:sz w:val="21"/>
+        </w:rPr>
+        <w:t>Optimized application performance, database operations, and system reliability through debugging and testing.</w:t>
+      </w:r>
+    </w:p>
+    <w:p>
+      <w:pPr>
+        <w:pStyle w:val="ListBullet"/>
+        <w:spacing w:before="0" w:after="20" w:lineRule="exact" w:line="226"/>
+      </w:pPr>
+      <w:r>
+        <w:rPr>
+          <w:rFonts w:ascii="Calibri" w:hAnsi="Calibri" w:eastAsia="Calibri"/>
+          <w:b w:val="0"/>
+          <w:sz w:val="21"/>
+        </w:rPr>
+        <w:t>Collaborated with cross-functional teams to deliver AI-driven and web-based solutions aligned with business requirements.</w:t>
+      </w:r>
+    </w:p>
+    <w:p>
+      <w:pPr>
+        <w:tabs>
+          <w:tab w:pos="10800" w:val="right"/>
+        </w:tabs>
+        <w:spacing w:before="80" w:after="0" w:lineRule="exact" w:line="216"/>
+      </w:pPr>
+      <w:r>
+        <w:rPr>
+          <w:rFonts w:ascii="Calibri" w:hAnsi="Calibri" w:eastAsia="Calibri"/>
+          <w:b/>
+          <w:sz w:val="21"/>
+        </w:rPr>
+        <w:t>LLM Prompt Engineer  |  Turing</w:t>
+      </w:r>
+      <w:r>
+        <w:rPr>
+          <w:rFonts w:ascii="Calibri" w:hAnsi="Calibri" w:eastAsia="Calibri"/>
+          <w:b w:val="0"/>
+          <w:sz w:val="21"/>
+        </w:rPr>
+        <w:tab/>
+        <w:t>Aug 2025 – Jan 2026</w:t>
+      </w:r>
+    </w:p>
+    <w:p>
+      <w:pPr>
+        <w:pStyle w:val="ListBullet"/>
+        <w:spacing w:before="0" w:after="20" w:lineRule="exact" w:line="226"/>
+      </w:pPr>
+      <w:r>
+        <w:rPr>
+          <w:rFonts w:ascii="Calibri" w:hAnsi="Calibri" w:eastAsia="Calibri"/>
+          <w:b w:val="0"/>
+          <w:sz w:val="21"/>
+        </w:rPr>
+        <w:t>Delivered high-quality multi-turn AI conversations focused on realistic user–assistant interactions and contextual accuracy.</w:t>
+      </w:r>
+    </w:p>
+    <w:p>
+      <w:pPr>
+        <w:pStyle w:val="ListBullet"/>
+        <w:spacing w:before="0" w:after="20" w:lineRule="exact" w:line="226"/>
+      </w:pPr>
+      <w:r>
+        <w:rPr>
+          <w:rFonts w:ascii="Calibri" w:hAnsi="Calibri" w:eastAsia="Calibri"/>
+          <w:b w:val="0"/>
+          <w:sz w:val="21"/>
+        </w:rPr>
+        <w:t>Designed and optimized prompt workflows to improve reasoning, instruction-following, and response consistency.</w:t>
+      </w:r>
+    </w:p>
+    <w:p>
+      <w:pPr>
+        <w:pStyle w:val="ListBullet"/>
+        <w:spacing w:before="0" w:after="20" w:lineRule="exact" w:line="226"/>
+      </w:pPr>
+      <w:r>
+        <w:rPr>
+          <w:rFonts w:ascii="Calibri" w:hAnsi="Calibri" w:eastAsia="Calibri"/>
+          <w:b w:val="0"/>
+          <w:sz w:val="21"/>
+        </w:rPr>
+        <w:t>Evaluated AI-generated outputs using quality guidelines for relevance, clarity, and conversational flow.</w:t>
+      </w:r>
+    </w:p>
+    <w:p>
+      <w:pPr>
+        <w:tabs>
+          <w:tab w:pos="10800" w:val="right"/>
+        </w:tabs>
+        <w:spacing w:before="80" w:after="0" w:lineRule="exact" w:line="216"/>
+      </w:pPr>
+      <w:r>
+        <w:rPr>
+          <w:rFonts w:ascii="Calibri" w:hAnsi="Calibri" w:eastAsia="Calibri"/>
+          <w:b/>
+          <w:sz w:val="21"/>
+        </w:rPr>
+        <w:t>Aether  |  Outlier.ai</w:t>
+      </w:r>
+      <w:r>
+        <w:rPr>
+          <w:rFonts w:ascii="Calibri" w:hAnsi="Calibri" w:eastAsia="Calibri"/>
+          <w:b w:val="0"/>
+          <w:sz w:val="21"/>
+        </w:rPr>
+        <w:tab/>
+        <w:t>May 2026 – Jun 2026</w:t>
+      </w:r>
+    </w:p>
+    <w:p>
+      <w:pPr>
+        <w:pStyle w:val="ListBullet"/>
+        <w:spacing w:before="0" w:after="20" w:lineRule="exact" w:line="226"/>
+      </w:pPr>
+      <w:r>
+        <w:rPr>
+          <w:rFonts w:ascii="Calibri" w:hAnsi="Calibri" w:eastAsia="Calibri"/>
+          <w:b w:val="0"/>
+          <w:sz w:val="21"/>
+        </w:rPr>
+        <w:t>Recorded multilingual voice samples using predefined prompts to support AI model training.</w:t>
+      </w:r>
+    </w:p>
+    <w:p>
+      <w:pPr>
+        <w:pStyle w:val="ListBullet"/>
+        <w:spacing w:before="0" w:after="20" w:lineRule="exact" w:line="226"/>
+      </w:pPr>
+      <w:r>
+        <w:rPr>
+          <w:rFonts w:ascii="Calibri" w:hAnsi="Calibri" w:eastAsia="Calibri"/>
+          <w:b w:val="0"/>
+          <w:sz w:val="21"/>
+        </w:rPr>
+        <w:t>Followed strict quality and language guidelines to ensure accurate and consistent speech data.</w:t>
       </w:r>
     </w:p>
     <w:p>
@@ -335,6 +497,72 @@
           <w:sz w:val="23"/>
         </w:rPr>
         <w:t>PROJECTS</w:t>
+      </w:r>
+    </w:p>
+    <w:p>
+      <w:pPr>
+        <w:tabs>
+          <w:tab w:pos="10800" w:val="right"/>
+        </w:tabs>
+        <w:spacing w:before="80" w:after="0" w:lineRule="exact" w:line="216"/>
+      </w:pPr>
+      <w:r>
+        <w:rPr>
+          <w:rFonts w:ascii="Calibri" w:hAnsi="Calibri" w:eastAsia="Calibri"/>
+          <w:b/>
+          <w:sz w:val="21"/>
+        </w:rPr>
+        <w:t>PulseBoard — Real-Time Team Collaboration Platform  |  github.com/Saisriya2003/pulseboard</w:t>
+      </w:r>
+      <w:r>
+        <w:rPr>
+          <w:rFonts w:ascii="Calibri" w:hAnsi="Calibri" w:eastAsia="Calibri"/>
+          <w:b w:val="0"/>
+          <w:sz w:val="21"/>
+        </w:rPr>
+        <w:tab/>
+        <w:t>September 2026</w:t>
+      </w:r>
+    </w:p>
+    <w:p>
+      <w:pPr>
+        <w:spacing w:before="0" w:after="40" w:lineRule="exact" w:line="220"/>
+      </w:pPr>
+      <w:r>
+        <w:rPr>
+          <w:rFonts w:ascii="Calibri" w:hAnsi="Calibri" w:eastAsia="Calibri"/>
+          <w:b w:val="0"/>
+          <w:sz w:val="20"/>
+        </w:rPr>
+        <w:t>Tech: Python, FastAPI, Socket.IO, React, TypeScript, PostgreSQL, Redis, Docker, Pytest, GitHub Actions</w:t>
+      </w:r>
+    </w:p>
+    <w:p>
+      <w:pPr>
+        <w:pStyle w:val="ListBullet"/>
+        <w:spacing w:before="0" w:after="20" w:lineRule="exact" w:line="226"/>
+      </w:pPr>
+      <w:r>
+        <w:rPr>
+          <w:rFonts w:ascii="Calibri" w:hAnsi="Calibri" w:eastAsia="Calibri"/>
+          <w:b w:val="0"/>
+          <w:sz w:val="21"/>
+        </w:rPr>
+        <w:t>Built a real-time kanban platform: workspaces, drag-and-drop boards, labels, checklists, @mentions, reactions, and live presence over Socket.IO; 30 Pytest integration tests run in GitHub Actions CI.</w:t>
+      </w:r>
+    </w:p>
+    <w:p>
+      <w:pPr>
+        <w:pStyle w:val="ListBullet"/>
+        <w:spacing w:before="0" w:after="20" w:lineRule="exact" w:line="226"/>
+      </w:pPr>
+      <w:r>
+        <w:rPr>
+          <w:rFonts w:ascii="Calibri" w:hAnsi="Calibri" w:eastAsia="Calibri"/>
+          <w:b w:val="0"/>
+          <w:sz w:val="21"/>
+        </w:rPr>
+        <w:t>Designed a four-role permission model (owner/admin/member/viewer) enforced server-side with JWT auth, invitations, audit logging, and Redis caching; containerized with Docker Compose.</w:t>
       </w:r>
     </w:p>
     <w:p>
@@ -386,21 +614,7 @@
           <w:b w:val="0"/>
           <w:sz w:val="21"/>
         </w:rPr>
-        <w:t>Built a full-stack platform to create, schedule, and publish content across YouTube, Instagram, Facebook, Twitter, LinkedIn, and TikTok.</w:t>
-      </w:r>
-    </w:p>
-    <w:p>
-      <w:pPr>
-        <w:pStyle w:val="ListBullet"/>
-        <w:spacing w:before="0" w:after="20" w:lineRule="exact" w:line="226"/>
-      </w:pPr>
-      <w:r>
-        <w:rPr>
-          <w:rFonts w:ascii="Calibri" w:hAnsi="Calibri" w:eastAsia="Calibri"/>
-          <w:b w:val="0"/>
-          <w:sz w:val="21"/>
-        </w:rPr>
-        <w:t>Developed a TypeScript React frontend (Vite, Tailwind CSS) and a Python FastAPI backend with REST APIs, JWT, PostgreSQL, and MongoDB; added Gemini captions, video analysis, dashboards, and OAuth.</w:t>
+        <w:t>Built a full-stack platform to create, schedule, and publish content to YouTube, Instagram, Facebook, Twitter, LinkedIn, and TikTok: TypeScript React frontend, FastAPI backend with JWT, PostgreSQL, MongoDB, OAuth, Gemini captions, and analytics dashboards.</w:t>
       </w:r>
     </w:p>
     <w:p>
@@ -430,19 +644,6 @@
     </w:p>
     <w:p>
       <w:pPr>
-        <w:spacing w:before="0" w:after="40" w:lineRule="exact" w:line="220"/>
-      </w:pPr>
-      <w:r>
-        <w:rPr>
-          <w:rFonts w:ascii="Calibri" w:hAnsi="Calibri" w:eastAsia="Calibri"/>
-          <w:b w:val="0"/>
-          <w:sz w:val="20"/>
-        </w:rPr>
-        <w:t>Tech: React, Node.js, Express.js, MongoDB, MySQL, REST APIs, Voice AI</w:t>
-      </w:r>
-    </w:p>
-    <w:p>
-      <w:pPr>
         <w:pStyle w:val="ListBullet"/>
         <w:spacing w:before="0" w:after="20" w:lineRule="exact" w:line="226"/>
       </w:pPr>
@@ -452,7 +653,7 @@
           <w:b w:val="0"/>
           <w:sz w:val="21"/>
         </w:rPr>
-        <w:t>Developed an AI status-call system for employee and field-agent tracking with outbound calls, transcription, monitoring dashboards, alerts, call logging, and reporting.</w:t>
+        <w:t>Shipped an AI status-call system for employee and field-agent tracking with automated outbound calls, transcription, live dashboards, alerts, and reporting. Tech: React, Node.js, Express.js, MongoDB, MySQL, Voice AI.</w:t>
       </w:r>
     </w:p>
     <w:p>
@@ -482,19 +683,6 @@
     </w:p>
     <w:p>
       <w:pPr>
-        <w:spacing w:before="0" w:after="40" w:lineRule="exact" w:line="220"/>
-      </w:pPr>
-      <w:r>
-        <w:rPr>
-          <w:rFonts w:ascii="Calibri" w:hAnsi="Calibri" w:eastAsia="Calibri"/>
-          <w:b w:val="0"/>
-          <w:sz w:val="20"/>
-        </w:rPr>
-        <w:t>Tech: Python, FastAPI, React, PostgreSQL, RAG, LLM, Embeddings</w:t>
-      </w:r>
-    </w:p>
-    <w:p>
-      <w:pPr>
         <w:pStyle w:val="ListBullet"/>
         <w:spacing w:before="0" w:after="20" w:lineRule="exact" w:line="226"/>
       </w:pPr>
@@ -504,7 +692,7 @@
           <w:b w:val="0"/>
           <w:sz w:val="21"/>
         </w:rPr>
-        <w:t>Built a Retrieval-Augmented Generation (RAG) system with document ingestion, embeddings, semantic search, and LLM answers through FastAPI, React, and PostgreSQL.</w:t>
+        <w:t>Built a Retrieval-Augmented Generation pipeline with document ingestion, embeddings, semantic search, and context-aware LLM answers. Tech: Python, FastAPI, React, PostgreSQL.</w:t>
       </w:r>
     </w:p>
     <w:p>
@@ -543,7 +731,7 @@
           <w:b w:val="0"/>
           <w:sz w:val="21"/>
         </w:rPr>
-        <w:t>Built a Python deep learning model using artificial neural networks and backpropagation to score friend-request authenticity on social-network data. Tech: Python, Machine Learning, Neural Networks.</w:t>
+        <w:t>Built a Python deep learning model using artificial neural networks and backpropagation to score friend-request authenticity on social-network data.</w:t>
       </w:r>
     </w:p>
     <w:p>
@@ -586,7 +774,7 @@
           <w:b w:val="0"/>
           <w:sz w:val="21"/>
         </w:rPr>
-        <w:t>Intermediate  |  Telangana State Residential Junior College (Girls), Bheemadevarapalle  |  Jun 2019 – Jul 2021  |  88%</w:t>
+        <w:t>Intermediate  |  Telangana State Residential Junior College (Girls), Huzurabad  |  Jun 2019 – Jul 2021  |  88%</w:t>
       </w:r>
     </w:p>
     <w:p>
@@ -629,7 +817,7 @@
           <w:b w:val="0"/>
           <w:sz w:val="21"/>
         </w:rPr>
-        <w:t>AICTE Frontend Development Internship (Responsive UI, HTML, CSS, JavaScript, React). Hands-on certifications in API Integration, Database Management, and Full-Stack Development.</w:t>
+        <w:t>AWS and Google Cloud foundational badges. Certifications in Generative AI, Prompt Engineering, Machine Learning, React.js, JavaScript, and Python. AICTE Frontend Development Internship; API Integration, Database Management, and Full-Stack Development.</w:t>
       </w:r>
     </w:p>
     <w:sectPr>

</xml_diff>